<commit_message>
Added Karachi.html page and CD Staging
</commit_message>
<xml_diff>
--- a/DF_TermProject_Spring2026.docx
+++ b/DF_TermProject_Spring2026.docx
@@ -444,14 +444,14 @@
         <w:tblLook w:val="04A0" w:firstRow="1" w:lastRow="0" w:firstColumn="1" w:lastColumn="0" w:noHBand="0" w:noVBand="1"/>
       </w:tblPr>
       <w:tblGrid>
-        <w:gridCol w:w="452"/>
-        <w:gridCol w:w="985"/>
-        <w:gridCol w:w="1208"/>
-        <w:gridCol w:w="1663"/>
-        <w:gridCol w:w="1141"/>
-        <w:gridCol w:w="1141"/>
-        <w:gridCol w:w="974"/>
-        <w:gridCol w:w="1441"/>
+        <w:gridCol w:w="420"/>
+        <w:gridCol w:w="871"/>
+        <w:gridCol w:w="1587"/>
+        <w:gridCol w:w="1445"/>
+        <w:gridCol w:w="1003"/>
+        <w:gridCol w:w="1276"/>
+        <w:gridCol w:w="2219"/>
+        <w:gridCol w:w="1257"/>
       </w:tblGrid>
       <w:tr>
         <w:tc>
@@ -1102,11 +1102,46 @@
             </w:tcMar>
             <w:vAlign w:val="center"/>
           </w:tcPr>
+          <w:p>
+            <w:r>
+              <w:t>Hamza</w:t>
+            </w:r>
+          </w:p>
+        </w:tc>
+        <w:tc>
+          <w:tcPr>
+            <w:tcW w:w="1400" w:type="dxa"/>
+            <w:tcBorders>
+              <w:top w:val="single" w:sz="1" w:space="0" w:color="AAAAAA"/>
+              <w:left w:val="single" w:sz="1" w:space="0" w:color="AAAAAA"/>
+              <w:bottom w:val="single" w:sz="1" w:space="0" w:color="AAAAAA"/>
+              <w:right w:val="single" w:sz="1" w:space="0" w:color="AAAAAA"/>
+            </w:tcBorders>
+            <w:shd w:val="clear" w:color="auto" w:fill="FFFFFF"/>
+            <w:tcMar>
+              <w:top w:w="80" w:type="dxa"/>
+              <w:left w:w="120" w:type="dxa"/>
+              <w:bottom w:w="80" w:type="dxa"/>
+              <w:right w:w="120" w:type="dxa"/>
+            </w:tcMar>
+            <w:vAlign w:val="center"/>
+          </w:tcPr>
+          <w:p>
+            <w:pPr>
+              <w:rPr>
+                <w:b/>
+                <w:bCs/>
+              </w:rPr>
+            </w:pPr>
+            <w:r>
+              <w:t>hamzaaftab525-stack</w:t>
+            </w:r>
+          </w:p>
           <w:p/>
         </w:tc>
         <w:tc>
           <w:tcPr>
-            <w:tcW w:w="1400" w:type="dxa"/>
+            <w:tcW w:w="1100" w:type="dxa"/>
             <w:tcBorders>
               <w:top w:val="single" w:sz="1" w:space="0" w:color="AAAAAA"/>
               <w:left w:val="single" w:sz="1" w:space="0" w:color="AAAAAA"/>
@@ -1122,11 +1157,15 @@
             </w:tcMar>
             <w:vAlign w:val="center"/>
           </w:tcPr>
-          <w:p/>
-        </w:tc>
-        <w:tc>
-          <w:tcPr>
-            <w:tcW w:w="1100" w:type="dxa"/>
+          <w:p>
+            <w:r>
+              <w:t>Member</w:t>
+            </w:r>
+          </w:p>
+        </w:tc>
+        <w:tc>
+          <w:tcPr>
+            <w:tcW w:w="1200" w:type="dxa"/>
             <w:tcBorders>
               <w:top w:val="single" w:sz="1" w:space="0" w:color="AAAAAA"/>
               <w:left w:val="single" w:sz="1" w:space="0" w:color="AAAAAA"/>
@@ -1142,7 +1181,11 @@
             </w:tcMar>
             <w:vAlign w:val="center"/>
           </w:tcPr>
-          <w:p/>
+          <w:p>
+            <w:r>
+              <w:t>CD Staging</w:t>
+            </w:r>
+          </w:p>
         </w:tc>
         <w:tc>
           <w:tcPr>
@@ -1162,7 +1205,14 @@
             </w:tcMar>
             <w:vAlign w:val="center"/>
           </w:tcPr>
-          <w:p/>
+          <w:p>
+            <w:r>
+              <w:t>Karachi</w:t>
+            </w:r>
+            <w:r>
+              <w:t>.html</w:t>
+            </w:r>
+          </w:p>
         </w:tc>
         <w:tc>
           <w:tcPr>
@@ -1182,11 +1232,18 @@
             </w:tcMar>
             <w:vAlign w:val="center"/>
           </w:tcPr>
-          <w:p/>
-        </w:tc>
-        <w:tc>
-          <w:tcPr>
-            <w:tcW w:w="1200" w:type="dxa"/>
+          <w:p>
+            <w:r>
+              <w:t>feature/</w:t>
+            </w:r>
+            <w:r>
+              <w:t>hamzaaftab525-stack</w:t>
+            </w:r>
+          </w:p>
+        </w:tc>
+        <w:tc>
+          <w:tcPr>
+            <w:tcW w:w="900" w:type="dxa"/>
             <w:tcBorders>
               <w:top w:val="single" w:sz="1" w:space="0" w:color="AAAAAA"/>
               <w:left w:val="single" w:sz="1" w:space="0" w:color="AAAAAA"/>
@@ -1202,27 +1259,11 @@
             </w:tcMar>
             <w:vAlign w:val="center"/>
           </w:tcPr>
-          <w:p/>
-        </w:tc>
-        <w:tc>
-          <w:tcPr>
-            <w:tcW w:w="900" w:type="dxa"/>
-            <w:tcBorders>
-              <w:top w:val="single" w:sz="1" w:space="0" w:color="AAAAAA"/>
-              <w:left w:val="single" w:sz="1" w:space="0" w:color="AAAAAA"/>
-              <w:bottom w:val="single" w:sz="1" w:space="0" w:color="AAAAAA"/>
-              <w:right w:val="single" w:sz="1" w:space="0" w:color="AAAAAA"/>
-            </w:tcBorders>
-            <w:shd w:val="clear" w:color="auto" w:fill="FFFFFF"/>
-            <w:tcMar>
-              <w:top w:w="80" w:type="dxa"/>
-              <w:left w:w="120" w:type="dxa"/>
-              <w:bottom w:w="80" w:type="dxa"/>
-              <w:right w:w="120" w:type="dxa"/>
-            </w:tcMar>
-            <w:vAlign w:val="center"/>
-          </w:tcPr>
-          <w:p/>
+          <w:p>
+            <w:r>
+              <w:t>Yes</w:t>
+            </w:r>
+          </w:p>
         </w:tc>
       </w:tr>
       <w:tr>
@@ -1756,6 +1797,7 @@
                 <w:sz w:val="20"/>
                 <w:szCs w:val="20"/>
               </w:rPr>
+              <w:lastRenderedPageBreak/>
               <w:t>Environment</w:t>
             </w:r>
           </w:p>
@@ -1891,7 +1933,6 @@
                 <w:sz w:val="20"/>
                 <w:szCs w:val="20"/>
               </w:rPr>
-              <w:lastRenderedPageBreak/>
               <w:t>Development</w:t>
             </w:r>
           </w:p>
@@ -3281,6 +3322,7 @@
                 <w:sz w:val="20"/>
                 <w:szCs w:val="20"/>
               </w:rPr>
+              <w:lastRenderedPageBreak/>
               <w:t>1</w:t>
             </w:r>
           </w:p>
@@ -3407,16 +3449,7 @@
                 <w:sz w:val="20"/>
                 <w:szCs w:val="20"/>
               </w:rPr>
-              <w:t xml:space="preserve"> HTML &amp; CSS Linting, Building with </w:t>
-            </w:r>
-            <w:r>
-              <w:rPr>
-                <w:color w:val="000000"/>
-                <w:sz w:val="20"/>
-                <w:szCs w:val="20"/>
-              </w:rPr>
-              <w:lastRenderedPageBreak/>
-              <w:t>Parcel,</w:t>
+              <w:t xml:space="preserve"> HTML &amp; CSS Linting, Building with Parcel,</w:t>
             </w:r>
             <w:r>
               <w:rPr>
@@ -3460,7 +3493,6 @@
                 <w:sz w:val="20"/>
                 <w:szCs w:val="20"/>
               </w:rPr>
-              <w:lastRenderedPageBreak/>
               <w:t>2</w:t>
             </w:r>
           </w:p>
@@ -13629,7 +13661,7 @@
       <w:tr>
         <w:tc>
           <w:tcPr>
-            <w:tcW w:w="3400" w:type="dxa"/>
+            <w:tcW w:w="3071" w:type="dxa"/>
             <w:tcBorders>
               <w:top w:val="single" w:sz="1" w:space="0" w:color="AAAAAA"/>
               <w:left w:val="single" w:sz="1" w:space="0" w:color="AAAAAA"/>
@@ -13663,7 +13695,7 @@
         </w:tc>
         <w:tc>
           <w:tcPr>
-            <w:tcW w:w="5960" w:type="dxa"/>
+            <w:tcW w:w="6289" w:type="dxa"/>
             <w:tcBorders>
               <w:top w:val="single" w:sz="1" w:space="0" w:color="AAAAAA"/>
               <w:left w:val="single" w:sz="1" w:space="0" w:color="AAAAAA"/>
@@ -13699,7 +13731,7 @@
       <w:tr>
         <w:tc>
           <w:tcPr>
-            <w:tcW w:w="3400" w:type="dxa"/>
+            <w:tcW w:w="3071" w:type="dxa"/>
             <w:tcBorders>
               <w:top w:val="single" w:sz="1" w:space="0" w:color="AAAAAA"/>
               <w:left w:val="single" w:sz="1" w:space="0" w:color="AAAAAA"/>
@@ -13730,7 +13762,7 @@
         </w:tc>
         <w:tc>
           <w:tcPr>
-            <w:tcW w:w="5960" w:type="dxa"/>
+            <w:tcW w:w="6289" w:type="dxa"/>
             <w:tcBorders>
               <w:top w:val="single" w:sz="1" w:space="0" w:color="AAAAAA"/>
               <w:left w:val="single" w:sz="1" w:space="0" w:color="AAAAAA"/>
@@ -13761,7 +13793,7 @@
       <w:tr>
         <w:tc>
           <w:tcPr>
-            <w:tcW w:w="3400" w:type="dxa"/>
+            <w:tcW w:w="3071" w:type="dxa"/>
             <w:tcBorders>
               <w:top w:val="single" w:sz="1" w:space="0" w:color="AAAAAA"/>
               <w:left w:val="single" w:sz="1" w:space="0" w:color="AAAAAA"/>
@@ -13792,7 +13824,7 @@
         </w:tc>
         <w:tc>
           <w:tcPr>
-            <w:tcW w:w="5960" w:type="dxa"/>
+            <w:tcW w:w="6289" w:type="dxa"/>
             <w:tcBorders>
               <w:top w:val="single" w:sz="1" w:space="0" w:color="AAAAAA"/>
               <w:left w:val="single" w:sz="1" w:space="0" w:color="AAAAAA"/>
@@ -13823,7 +13855,7 @@
       <w:tr>
         <w:tc>
           <w:tcPr>
-            <w:tcW w:w="3400" w:type="dxa"/>
+            <w:tcW w:w="3071" w:type="dxa"/>
             <w:tcBorders>
               <w:top w:val="single" w:sz="1" w:space="0" w:color="AAAAAA"/>
               <w:left w:val="single" w:sz="1" w:space="0" w:color="AAAAAA"/>
@@ -13854,7 +13886,7 @@
         </w:tc>
         <w:tc>
           <w:tcPr>
-            <w:tcW w:w="5960" w:type="dxa"/>
+            <w:tcW w:w="6289" w:type="dxa"/>
             <w:tcBorders>
               <w:top w:val="single" w:sz="1" w:space="0" w:color="AAAAAA"/>
               <w:left w:val="single" w:sz="1" w:space="0" w:color="AAAAAA"/>
@@ -13885,7 +13917,7 @@
       <w:tr>
         <w:tc>
           <w:tcPr>
-            <w:tcW w:w="3400" w:type="dxa"/>
+            <w:tcW w:w="3071" w:type="dxa"/>
             <w:tcBorders>
               <w:top w:val="single" w:sz="1" w:space="0" w:color="AAAAAA"/>
               <w:left w:val="single" w:sz="1" w:space="0" w:color="AAAAAA"/>
@@ -13916,7 +13948,7 @@
         </w:tc>
         <w:tc>
           <w:tcPr>
-            <w:tcW w:w="5960" w:type="dxa"/>
+            <w:tcW w:w="6289" w:type="dxa"/>
             <w:tcBorders>
               <w:top w:val="single" w:sz="1" w:space="0" w:color="AAAAAA"/>
               <w:left w:val="single" w:sz="1" w:space="0" w:color="AAAAAA"/>
@@ -13947,7 +13979,7 @@
       <w:tr>
         <w:tc>
           <w:tcPr>
-            <w:tcW w:w="3400" w:type="dxa"/>
+            <w:tcW w:w="3071" w:type="dxa"/>
             <w:tcBorders>
               <w:top w:val="single" w:sz="1" w:space="0" w:color="AAAAAA"/>
               <w:left w:val="single" w:sz="1" w:space="0" w:color="AAAAAA"/>
@@ -13978,7 +14010,7 @@
         </w:tc>
         <w:tc>
           <w:tcPr>
-            <w:tcW w:w="5960" w:type="dxa"/>
+            <w:tcW w:w="6289" w:type="dxa"/>
             <w:tcBorders>
               <w:top w:val="single" w:sz="1" w:space="0" w:color="AAAAAA"/>
               <w:left w:val="single" w:sz="1" w:space="0" w:color="AAAAAA"/>
@@ -14009,7 +14041,7 @@
       <w:tr>
         <w:tc>
           <w:tcPr>
-            <w:tcW w:w="3400" w:type="dxa"/>
+            <w:tcW w:w="3071" w:type="dxa"/>
             <w:tcBorders>
               <w:top w:val="single" w:sz="1" w:space="0" w:color="AAAAAA"/>
               <w:left w:val="single" w:sz="1" w:space="0" w:color="AAAAAA"/>
@@ -14040,7 +14072,7 @@
         </w:tc>
         <w:tc>
           <w:tcPr>
-            <w:tcW w:w="5960" w:type="dxa"/>
+            <w:tcW w:w="6289" w:type="dxa"/>
             <w:tcBorders>
               <w:top w:val="single" w:sz="1" w:space="0" w:color="AAAAAA"/>
               <w:left w:val="single" w:sz="1" w:space="0" w:color="AAAAAA"/>
@@ -14071,7 +14103,7 @@
       <w:tr>
         <w:tc>
           <w:tcPr>
-            <w:tcW w:w="3400" w:type="dxa"/>
+            <w:tcW w:w="3071" w:type="dxa"/>
             <w:tcBorders>
               <w:top w:val="single" w:sz="1" w:space="0" w:color="AAAAAA"/>
               <w:left w:val="single" w:sz="1" w:space="0" w:color="AAAAAA"/>
@@ -14102,7 +14134,7 @@
         </w:tc>
         <w:tc>
           <w:tcPr>
-            <w:tcW w:w="5960" w:type="dxa"/>
+            <w:tcW w:w="6289" w:type="dxa"/>
             <w:tcBorders>
               <w:top w:val="single" w:sz="1" w:space="0" w:color="AAAAAA"/>
               <w:left w:val="single" w:sz="1" w:space="0" w:color="AAAAAA"/>
@@ -14133,7 +14165,7 @@
       <w:tr>
         <w:tc>
           <w:tcPr>
-            <w:tcW w:w="3400" w:type="dxa"/>
+            <w:tcW w:w="3071" w:type="dxa"/>
             <w:tcBorders>
               <w:top w:val="single" w:sz="1" w:space="0" w:color="AAAAAA"/>
               <w:left w:val="single" w:sz="1" w:space="0" w:color="AAAAAA"/>
@@ -14164,7 +14196,7 @@
         </w:tc>
         <w:tc>
           <w:tcPr>
-            <w:tcW w:w="5960" w:type="dxa"/>
+            <w:tcW w:w="6289" w:type="dxa"/>
             <w:tcBorders>
               <w:top w:val="single" w:sz="1" w:space="0" w:color="AAAAAA"/>
               <w:left w:val="single" w:sz="1" w:space="0" w:color="AAAAAA"/>
@@ -14195,7 +14227,7 @@
       <w:tr>
         <w:tc>
           <w:tcPr>
-            <w:tcW w:w="3400" w:type="dxa"/>
+            <w:tcW w:w="3071" w:type="dxa"/>
             <w:tcBorders>
               <w:top w:val="single" w:sz="1" w:space="0" w:color="AAAAAA"/>
               <w:left w:val="single" w:sz="1" w:space="0" w:color="AAAAAA"/>
@@ -14226,7 +14258,7 @@
         </w:tc>
         <w:tc>
           <w:tcPr>
-            <w:tcW w:w="5960" w:type="dxa"/>
+            <w:tcW w:w="6289" w:type="dxa"/>
             <w:tcBorders>
               <w:top w:val="single" w:sz="1" w:space="0" w:color="AAAAAA"/>
               <w:left w:val="single" w:sz="1" w:space="0" w:color="AAAAAA"/>
@@ -14257,7 +14289,7 @@
       <w:tr>
         <w:tc>
           <w:tcPr>
-            <w:tcW w:w="3400" w:type="dxa"/>
+            <w:tcW w:w="3071" w:type="dxa"/>
             <w:tcBorders>
               <w:top w:val="single" w:sz="1" w:space="0" w:color="AAAAAA"/>
               <w:left w:val="single" w:sz="1" w:space="0" w:color="AAAAAA"/>
@@ -14288,7 +14320,7 @@
         </w:tc>
         <w:tc>
           <w:tcPr>
-            <w:tcW w:w="5960" w:type="dxa"/>
+            <w:tcW w:w="6289" w:type="dxa"/>
             <w:tcBorders>
               <w:top w:val="single" w:sz="1" w:space="0" w:color="AAAAAA"/>
               <w:left w:val="single" w:sz="1" w:space="0" w:color="AAAAAA"/>
@@ -14319,7 +14351,7 @@
       <w:tr>
         <w:tc>
           <w:tcPr>
-            <w:tcW w:w="3400" w:type="dxa"/>
+            <w:tcW w:w="3071" w:type="dxa"/>
             <w:tcBorders>
               <w:top w:val="single" w:sz="1" w:space="0" w:color="AAAAAA"/>
               <w:left w:val="single" w:sz="1" w:space="0" w:color="AAAAAA"/>
@@ -14350,7 +14382,7 @@
         </w:tc>
         <w:tc>
           <w:tcPr>
-            <w:tcW w:w="5960" w:type="dxa"/>
+            <w:tcW w:w="6289" w:type="dxa"/>
             <w:tcBorders>
               <w:top w:val="single" w:sz="1" w:space="0" w:color="AAAAAA"/>
               <w:left w:val="single" w:sz="1" w:space="0" w:color="AAAAAA"/>
@@ -14381,7 +14413,7 @@
       <w:tr>
         <w:tc>
           <w:tcPr>
-            <w:tcW w:w="3400" w:type="dxa"/>
+            <w:tcW w:w="3071" w:type="dxa"/>
             <w:tcBorders>
               <w:top w:val="single" w:sz="1" w:space="0" w:color="AAAAAA"/>
               <w:left w:val="single" w:sz="1" w:space="0" w:color="AAAAAA"/>
@@ -14412,7 +14444,7 @@
         </w:tc>
         <w:tc>
           <w:tcPr>
-            <w:tcW w:w="5960" w:type="dxa"/>
+            <w:tcW w:w="6289" w:type="dxa"/>
             <w:tcBorders>
               <w:top w:val="single" w:sz="1" w:space="0" w:color="AAAAAA"/>
               <w:left w:val="single" w:sz="1" w:space="0" w:color="AAAAAA"/>
@@ -14443,7 +14475,7 @@
       <w:tr>
         <w:tc>
           <w:tcPr>
-            <w:tcW w:w="3400" w:type="dxa"/>
+            <w:tcW w:w="3071" w:type="dxa"/>
             <w:tcBorders>
               <w:top w:val="single" w:sz="1" w:space="0" w:color="AAAAAA"/>
               <w:left w:val="single" w:sz="1" w:space="0" w:color="AAAAAA"/>
@@ -14474,7 +14506,7 @@
         </w:tc>
         <w:tc>
           <w:tcPr>
-            <w:tcW w:w="5960" w:type="dxa"/>
+            <w:tcW w:w="6289" w:type="dxa"/>
             <w:tcBorders>
               <w:top w:val="single" w:sz="1" w:space="0" w:color="AAAAAA"/>
               <w:left w:val="single" w:sz="1" w:space="0" w:color="AAAAAA"/>
@@ -14505,7 +14537,7 @@
       <w:tr>
         <w:tc>
           <w:tcPr>
-            <w:tcW w:w="3400" w:type="dxa"/>
+            <w:tcW w:w="3071" w:type="dxa"/>
             <w:tcBorders>
               <w:top w:val="single" w:sz="1" w:space="0" w:color="AAAAAA"/>
               <w:left w:val="single" w:sz="1" w:space="0" w:color="AAAAAA"/>
@@ -14536,7 +14568,7 @@
         </w:tc>
         <w:tc>
           <w:tcPr>
-            <w:tcW w:w="5960" w:type="dxa"/>
+            <w:tcW w:w="6289" w:type="dxa"/>
             <w:tcBorders>
               <w:top w:val="single" w:sz="1" w:space="0" w:color="AAAAAA"/>
               <w:left w:val="single" w:sz="1" w:space="0" w:color="AAAAAA"/>
@@ -14567,7 +14599,7 @@
       <w:tr>
         <w:tc>
           <w:tcPr>
-            <w:tcW w:w="3400" w:type="dxa"/>
+            <w:tcW w:w="3071" w:type="dxa"/>
             <w:tcBorders>
               <w:top w:val="single" w:sz="1" w:space="0" w:color="AAAAAA"/>
               <w:left w:val="single" w:sz="1" w:space="0" w:color="AAAAAA"/>
@@ -14598,7 +14630,7 @@
         </w:tc>
         <w:tc>
           <w:tcPr>
-            <w:tcW w:w="5960" w:type="dxa"/>
+            <w:tcW w:w="6289" w:type="dxa"/>
             <w:tcBorders>
               <w:top w:val="single" w:sz="1" w:space="0" w:color="AAAAAA"/>
               <w:left w:val="single" w:sz="1" w:space="0" w:color="AAAAAA"/>
@@ -14629,7 +14661,7 @@
       <w:tr>
         <w:tc>
           <w:tcPr>
-            <w:tcW w:w="3400" w:type="dxa"/>
+            <w:tcW w:w="3071" w:type="dxa"/>
             <w:tcBorders>
               <w:top w:val="single" w:sz="1" w:space="0" w:color="AAAAAA"/>
               <w:left w:val="single" w:sz="1" w:space="0" w:color="AAAAAA"/>
@@ -14660,7 +14692,7 @@
         </w:tc>
         <w:tc>
           <w:tcPr>
-            <w:tcW w:w="5960" w:type="dxa"/>
+            <w:tcW w:w="6289" w:type="dxa"/>
             <w:tcBorders>
               <w:top w:val="single" w:sz="1" w:space="0" w:color="AAAAAA"/>
               <w:left w:val="single" w:sz="1" w:space="0" w:color="AAAAAA"/>
@@ -14691,7 +14723,7 @@
       <w:tr>
         <w:tc>
           <w:tcPr>
-            <w:tcW w:w="3400" w:type="dxa"/>
+            <w:tcW w:w="3071" w:type="dxa"/>
             <w:tcBorders>
               <w:top w:val="single" w:sz="1" w:space="0" w:color="AAAAAA"/>
               <w:left w:val="single" w:sz="1" w:space="0" w:color="AAAAAA"/>
@@ -14722,7 +14754,7 @@
         </w:tc>
         <w:tc>
           <w:tcPr>
-            <w:tcW w:w="5960" w:type="dxa"/>
+            <w:tcW w:w="6289" w:type="dxa"/>
             <w:tcBorders>
               <w:top w:val="single" w:sz="1" w:space="0" w:color="AAAAAA"/>
               <w:left w:val="single" w:sz="1" w:space="0" w:color="AAAAAA"/>
@@ -14753,7 +14785,7 @@
       <w:tr>
         <w:tc>
           <w:tcPr>
-            <w:tcW w:w="3400" w:type="dxa"/>
+            <w:tcW w:w="3071" w:type="dxa"/>
             <w:tcBorders>
               <w:top w:val="single" w:sz="1" w:space="0" w:color="AAAAAA"/>
               <w:left w:val="single" w:sz="1" w:space="0" w:color="AAAAAA"/>
@@ -14784,7 +14816,7 @@
         </w:tc>
         <w:tc>
           <w:tcPr>
-            <w:tcW w:w="5960" w:type="dxa"/>
+            <w:tcW w:w="6289" w:type="dxa"/>
             <w:tcBorders>
               <w:top w:val="single" w:sz="1" w:space="0" w:color="AAAAAA"/>
               <w:left w:val="single" w:sz="1" w:space="0" w:color="AAAAAA"/>
@@ -14815,7 +14847,7 @@
       <w:tr>
         <w:tc>
           <w:tcPr>
-            <w:tcW w:w="3400" w:type="dxa"/>
+            <w:tcW w:w="3071" w:type="dxa"/>
             <w:tcBorders>
               <w:top w:val="single" w:sz="1" w:space="0" w:color="AAAAAA"/>
               <w:left w:val="single" w:sz="1" w:space="0" w:color="AAAAAA"/>
@@ -14847,7 +14879,7 @@
         </w:tc>
         <w:tc>
           <w:tcPr>
-            <w:tcW w:w="5960" w:type="dxa"/>
+            <w:tcW w:w="6289" w:type="dxa"/>
             <w:tcBorders>
               <w:top w:val="single" w:sz="1" w:space="0" w:color="AAAAAA"/>
               <w:left w:val="single" w:sz="1" w:space="0" w:color="AAAAAA"/>
@@ -14876,10 +14908,51 @@
         </w:tc>
       </w:tr>
     </w:tbl>
-    <w:p/>
+    <w:p>
+      <w:r>
+        <w:rPr>
+          <w:noProof/>
+        </w:rPr>
+        <w:drawing>
+          <wp:inline distT="0" distB="0" distL="0" distR="0" wp14:anchorId="075D0D41" wp14:editId="10F9F15A">
+            <wp:extent cx="6400800" cy="3598545"/>
+            <wp:effectExtent l="0" t="0" r="0" b="1905"/>
+            <wp:docPr id="1970137626" name="Picture 1"/>
+            <wp:cNvGraphicFramePr>
+              <a:graphicFrameLocks xmlns:a="http://schemas.openxmlformats.org/drawingml/2006/main" noChangeAspect="1"/>
+            </wp:cNvGraphicFramePr>
+            <a:graphic xmlns:a="http://schemas.openxmlformats.org/drawingml/2006/main">
+              <a:graphicData uri="http://schemas.openxmlformats.org/drawingml/2006/picture">
+                <pic:pic xmlns:pic="http://schemas.openxmlformats.org/drawingml/2006/picture">
+                  <pic:nvPicPr>
+                    <pic:cNvPr id="1970137626" name=""/>
+                    <pic:cNvPicPr/>
+                  </pic:nvPicPr>
+                  <pic:blipFill>
+                    <a:blip r:embed="rId7"/>
+                    <a:stretch>
+                      <a:fillRect/>
+                    </a:stretch>
+                  </pic:blipFill>
+                  <pic:spPr>
+                    <a:xfrm>
+                      <a:off x="0" y="0"/>
+                      <a:ext cx="6400800" cy="3598545"/>
+                    </a:xfrm>
+                    <a:prstGeom prst="rect">
+                      <a:avLst/>
+                    </a:prstGeom>
+                  </pic:spPr>
+                </pic:pic>
+              </a:graphicData>
+            </a:graphic>
+          </wp:inline>
+        </w:drawing>
+      </w:r>
+    </w:p>
     <w:sectPr>
-      <w:headerReference w:type="default" r:id="rId7"/>
-      <w:footerReference w:type="default" r:id="rId8"/>
+      <w:headerReference w:type="default" r:id="rId8"/>
+      <w:footerReference w:type="default" r:id="rId9"/>
       <w:pgSz w:w="12240" w:h="15840"/>
       <w:pgMar w:top="1080" w:right="1080" w:bottom="1080" w:left="1080" w:header="708" w:footer="708" w:gutter="0"/>
       <w:cols w:space="720"/>
@@ -16042,7 +16115,6 @@
   <w:style w:type="character" w:default="1" w:styleId="DefaultParagraphFont">
     <w:name w:val="Default Paragraph Font"/>
     <w:uiPriority w:val="1"/>
-    <w:semiHidden/>
     <w:unhideWhenUsed/>
   </w:style>
   <w:style w:type="table" w:default="1" w:styleId="TableNormal">

</xml_diff>

<commit_message>
Added lahore.html and cd-dev
</commit_message>
<xml_diff>
--- a/DF_TermProject_Spring2026.docx
+++ b/DF_TermProject_Spring2026.docx
@@ -444,14 +444,14 @@
         <w:tblLook w:val="04A0" w:firstRow="1" w:lastRow="0" w:firstColumn="1" w:lastColumn="0" w:noHBand="0" w:noVBand="1"/>
       </w:tblPr>
       <w:tblGrid>
-        <w:gridCol w:w="452"/>
-        <w:gridCol w:w="985"/>
-        <w:gridCol w:w="1208"/>
-        <w:gridCol w:w="1663"/>
-        <w:gridCol w:w="1141"/>
-        <w:gridCol w:w="1141"/>
-        <w:gridCol w:w="974"/>
-        <w:gridCol w:w="1441"/>
+        <w:gridCol w:w="411"/>
+        <w:gridCol w:w="1130"/>
+        <w:gridCol w:w="1397"/>
+        <w:gridCol w:w="1390"/>
+        <w:gridCol w:w="968"/>
+        <w:gridCol w:w="968"/>
+        <w:gridCol w:w="2603"/>
+        <w:gridCol w:w="1211"/>
       </w:tblGrid>
       <w:tr>
         <w:tc>
@@ -936,7 +936,11 @@
             </w:tcMar>
             <w:vAlign w:val="center"/>
           </w:tcPr>
-          <w:p/>
+          <w:p>
+            <w:r>
+              <w:t>Salahuddin Momi</w:t>
+            </w:r>
+          </w:p>
         </w:tc>
         <w:tc>
           <w:tcPr>
@@ -956,7 +960,11 @@
             </w:tcMar>
             <w:vAlign w:val="center"/>
           </w:tcPr>
-          <w:p/>
+          <w:p>
+            <w:r>
+              <w:t>l1f21bsse0152</w:t>
+            </w:r>
+          </w:p>
         </w:tc>
         <w:tc>
           <w:tcPr>
@@ -976,7 +984,11 @@
             </w:tcMar>
             <w:vAlign w:val="center"/>
           </w:tcPr>
-          <w:p/>
+          <w:p>
+            <w:r>
+              <w:t>Member</w:t>
+            </w:r>
+          </w:p>
         </w:tc>
         <w:tc>
           <w:tcPr>
@@ -996,7 +1008,11 @@
             </w:tcMar>
             <w:vAlign w:val="center"/>
           </w:tcPr>
-          <w:p/>
+          <w:p>
+            <w:r>
+              <w:t>cd-dev</w:t>
+            </w:r>
+          </w:p>
         </w:tc>
         <w:tc>
           <w:tcPr>
@@ -1016,7 +1032,11 @@
             </w:tcMar>
             <w:vAlign w:val="center"/>
           </w:tcPr>
-          <w:p/>
+          <w:p>
+            <w:r>
+              <w:t>Lahore</w:t>
+            </w:r>
+          </w:p>
         </w:tc>
         <w:tc>
           <w:tcPr>
@@ -1036,7 +1056,11 @@
             </w:tcMar>
             <w:vAlign w:val="center"/>
           </w:tcPr>
-          <w:p/>
+          <w:p>
+            <w:r>
+              <w:t>Feature/l1f21bsse0152/lahore</w:t>
+            </w:r>
+          </w:p>
         </w:tc>
         <w:tc>
           <w:tcPr>
@@ -1056,7 +1080,11 @@
             </w:tcMar>
             <w:vAlign w:val="center"/>
           </w:tcPr>
-          <w:p/>
+          <w:p>
+            <w:r>
+              <w:t>Yes</w:t>
+            </w:r>
+          </w:p>
         </w:tc>
       </w:tr>
       <w:tr>
@@ -1756,6 +1784,7 @@
                 <w:sz w:val="20"/>
                 <w:szCs w:val="20"/>
               </w:rPr>
+              <w:lastRenderedPageBreak/>
               <w:t>Environment</w:t>
             </w:r>
           </w:p>
@@ -1891,7 +1920,6 @@
                 <w:sz w:val="20"/>
                 <w:szCs w:val="20"/>
               </w:rPr>
-              <w:lastRenderedPageBreak/>
               <w:t>Development</w:t>
             </w:r>
           </w:p>
@@ -3281,6 +3309,7 @@
                 <w:sz w:val="20"/>
                 <w:szCs w:val="20"/>
               </w:rPr>
+              <w:lastRenderedPageBreak/>
               <w:t>1</w:t>
             </w:r>
           </w:p>
@@ -3407,16 +3436,7 @@
                 <w:sz w:val="20"/>
                 <w:szCs w:val="20"/>
               </w:rPr>
-              <w:t xml:space="preserve"> HTML &amp; CSS Linting, Building with </w:t>
-            </w:r>
-            <w:r>
-              <w:rPr>
-                <w:color w:val="000000"/>
-                <w:sz w:val="20"/>
-                <w:szCs w:val="20"/>
-              </w:rPr>
-              <w:lastRenderedPageBreak/>
-              <w:t>Parcel,</w:t>
+              <w:t xml:space="preserve"> HTML &amp; CSS Linting, Building with Parcel,</w:t>
             </w:r>
             <w:r>
               <w:rPr>
@@ -3460,7 +3480,6 @@
                 <w:sz w:val="20"/>
                 <w:szCs w:val="20"/>
               </w:rPr>
-              <w:lastRenderedPageBreak/>
               <w:t>2</w:t>
             </w:r>
           </w:p>

</xml_diff>

<commit_message>
Added hunza page and ci-staging
</commit_message>
<xml_diff>
--- a/DF_TermProject_Spring2026.docx
+++ b/DF_TermProject_Spring2026.docx
@@ -444,14 +444,14 @@
         <w:tblLook w:val="04A0" w:firstRow="1" w:lastRow="0" w:firstColumn="1" w:lastColumn="0" w:noHBand="0" w:noVBand="1"/>
       </w:tblPr>
       <w:tblGrid>
-        <w:gridCol w:w="452"/>
-        <w:gridCol w:w="985"/>
-        <w:gridCol w:w="1208"/>
-        <w:gridCol w:w="1663"/>
-        <w:gridCol w:w="1141"/>
-        <w:gridCol w:w="1141"/>
-        <w:gridCol w:w="974"/>
-        <w:gridCol w:w="1441"/>
+        <w:gridCol w:w="421"/>
+        <w:gridCol w:w="1177"/>
+        <w:gridCol w:w="1157"/>
+        <w:gridCol w:w="1451"/>
+        <w:gridCol w:w="1007"/>
+        <w:gridCol w:w="1187"/>
+        <w:gridCol w:w="2416"/>
+        <w:gridCol w:w="1262"/>
       </w:tblGrid>
       <w:tr>
         <w:tc>
@@ -1434,7 +1434,11 @@
             </w:tcMar>
             <w:vAlign w:val="center"/>
           </w:tcPr>
-          <w:p/>
+          <w:p>
+            <w:r>
+              <w:t>AffanBadar</w:t>
+            </w:r>
+          </w:p>
         </w:tc>
         <w:tc>
           <w:tcPr>
@@ -1454,7 +1458,11 @@
             </w:tcMar>
             <w:vAlign w:val="center"/>
           </w:tcPr>
-          <w:p/>
+          <w:p>
+            <w:r>
+              <w:t>Affanbadar</w:t>
+            </w:r>
+          </w:p>
         </w:tc>
         <w:tc>
           <w:tcPr>
@@ -1474,7 +1482,11 @@
             </w:tcMar>
             <w:vAlign w:val="center"/>
           </w:tcPr>
-          <w:p/>
+          <w:p>
+            <w:r>
+              <w:t>Member</w:t>
+            </w:r>
+          </w:p>
         </w:tc>
         <w:tc>
           <w:tcPr>
@@ -1494,7 +1506,11 @@
             </w:tcMar>
             <w:vAlign w:val="center"/>
           </w:tcPr>
-          <w:p/>
+          <w:p>
+            <w:r>
+              <w:t>CI Staging</w:t>
+            </w:r>
+          </w:p>
         </w:tc>
         <w:tc>
           <w:tcPr>
@@ -1514,7 +1530,11 @@
             </w:tcMar>
             <w:vAlign w:val="center"/>
           </w:tcPr>
-          <w:p/>
+          <w:p>
+            <w:r>
+              <w:t>Hunza.html</w:t>
+            </w:r>
+          </w:p>
         </w:tc>
         <w:tc>
           <w:tcPr>
@@ -1534,7 +1554,17 @@
             </w:tcMar>
             <w:vAlign w:val="center"/>
           </w:tcPr>
-          <w:p/>
+          <w:p>
+            <w:r>
+              <w:t>Feature/</w:t>
+            </w:r>
+            <w:r>
+              <w:t>Affanbadar</w:t>
+            </w:r>
+            <w:r>
+              <w:t>/hunza</w:t>
+            </w:r>
+          </w:p>
         </w:tc>
         <w:tc>
           <w:tcPr>
@@ -1554,7 +1584,11 @@
             </w:tcMar>
             <w:vAlign w:val="center"/>
           </w:tcPr>
-          <w:p/>
+          <w:p>
+            <w:r>
+              <w:t>Yes</w:t>
+            </w:r>
+          </w:p>
         </w:tc>
       </w:tr>
     </w:tbl>

</xml_diff>